<commit_message>
Apply cross-system audit fixes
BESTAE: t5 #E8F6C4, t8 #D2DCE8, t10 #F7D0E6 so domain tints are distinct
(t10 at 32% keeps denim links above 4.5:1). Greyscale: link #5E5E5E and a
named coding set. MBE: accent-bloom-deep #e3008c and border-strong #a48061.
Swatches, Word template, PowerPoint copy, greyscale skill copy and repo
copies of the design systems updated; audit and handoff marked.

Co-Authored-By: Claude Opus 5.5 <noreply@anthropic.com>
Claude-Session: https://claude.ai/code/session_01QCmM6DGQPCkNA2jgkdPRkH
</commit_message>
<xml_diff>
--- a/brand/bestae/templates/BESTAE Word Template.docx
+++ b/brand/bestae/templates/BESTAE Word Template.docx
@@ -329,7 +329,7 @@
               <w:bottom w:val="none" w:color="FFFFFF" w:sz="0"/>
               <w:right w:val="none" w:color="FFFFFF" w:sz="0"/>
             </w:tcBorders>
-            <w:shd w:fill="D5EBEE" w:color="auto" w:val="clear"/>
+            <w:shd w:fill="D2DCE8" w:color="auto" w:val="clear"/>
             <w:tcMar>
               <w:top w:type="dxa" w:w="90"/>
               <w:left w:type="dxa" w:w="140"/>
@@ -394,7 +394,7 @@
               <w:bottom w:val="none" w:color="FFFFFF" w:sz="0"/>
               <w:right w:val="none" w:color="FFFFFF" w:sz="0"/>
             </w:tcBorders>
-            <w:shd w:fill="EFF4A4" w:color="auto" w:val="clear"/>
+            <w:shd w:fill="E8F6C4" w:color="auto" w:val="clear"/>
             <w:tcMar>
               <w:top w:type="dxa" w:w="90"/>
               <w:left w:type="dxa" w:w="140"/>
@@ -535,7 +535,7 @@
               <w:bottom w:val="none" w:color="FFFFFF" w:sz="0"/>
               <w:right w:val="none" w:color="FFFFFF" w:sz="0"/>
             </w:tcBorders>
-            <w:shd w:fill="F2DEE9" w:color="auto" w:val="clear"/>
+            <w:shd w:fill="F7D0E6" w:color="auto" w:val="clear"/>
             <w:tcMar>
               <w:top w:type="dxa" w:w="90"/>
               <w:left w:type="dxa" w:w="140"/>
@@ -2594,7 +2594,7 @@
               <w:bottom w:val="single" w:color="C9CDD6" w:sz="4"/>
               <w:right w:val="single" w:color="C9CDD6" w:sz="4"/>
             </w:tcBorders>
-            <w:shd w:fill="EFF4A4" w:color="auto" w:val="clear"/>
+            <w:shd w:fill="E8F6C4" w:color="auto" w:val="clear"/>
             <w:tcMar>
               <w:top w:type="dxa" w:w="90"/>
               <w:left w:type="dxa" w:w="140"/>
@@ -2669,23 +2669,23 @@
               <w:bottom w:val="single" w:color="C9CDD6" w:sz="4"/>
               <w:right w:val="single" w:color="C9CDD6" w:sz="4"/>
             </w:tcBorders>
-            <w:shd w:fill="EFF4A4" w:color="auto" w:val="clear"/>
-            <w:tcMar>
-              <w:top w:type="dxa" w:w="90"/>
-              <w:left w:type="dxa" w:w="140"/>
-              <w:bottom w:type="dxa" w:w="90"/>
-              <w:right w:type="dxa" w:w="140"/>
-            </w:tcMar>
-          </w:tcPr>
-          <w:p>
-            <w:pPr>
-              <w:pStyle w:val="TableText"/>
-            </w:pPr>
-            <w:r>
-              <w:rPr>
-                <w:rFonts w:ascii="Lato" w:cs="Lato" w:eastAsia="Lato" w:hAnsi="Lato"/>
-              </w:rPr>
-              <w:t xml:space="preserve">#EFF4A4</w:t>
+            <w:shd w:fill="E8F6C4" w:color="auto" w:val="clear"/>
+            <w:tcMar>
+              <w:top w:type="dxa" w:w="90"/>
+              <w:left w:type="dxa" w:w="140"/>
+              <w:bottom w:type="dxa" w:w="90"/>
+              <w:right w:type="dxa" w:w="140"/>
+            </w:tcMar>
+          </w:tcPr>
+          <w:p>
+            <w:pPr>
+              <w:pStyle w:val="TableText"/>
+            </w:pPr>
+            <w:r>
+              <w:rPr>
+                <w:rFonts w:ascii="Lato" w:cs="Lato" w:eastAsia="Lato" w:hAnsi="Lato"/>
+              </w:rPr>
+              <w:t xml:space="preserve">#E8F6C4</w:t>
             </w:r>
           </w:p>
         </w:tc>
@@ -2870,7 +2870,7 @@
               <w:bottom w:val="single" w:color="C9CDD6" w:sz="4"/>
               <w:right w:val="single" w:color="C9CDD6" w:sz="4"/>
             </w:tcBorders>
-            <w:shd w:fill="D5EBEE" w:color="auto" w:val="clear"/>
+            <w:shd w:fill="D2DCE8" w:color="auto" w:val="clear"/>
             <w:tcMar>
               <w:top w:type="dxa" w:w="90"/>
               <w:left w:type="dxa" w:w="140"/>
@@ -2945,23 +2945,23 @@
               <w:bottom w:val="single" w:color="C9CDD6" w:sz="4"/>
               <w:right w:val="single" w:color="C9CDD6" w:sz="4"/>
             </w:tcBorders>
-            <w:shd w:fill="D5EBEE" w:color="auto" w:val="clear"/>
-            <w:tcMar>
-              <w:top w:type="dxa" w:w="90"/>
-              <w:left w:type="dxa" w:w="140"/>
-              <w:bottom w:type="dxa" w:w="90"/>
-              <w:right w:type="dxa" w:w="140"/>
-            </w:tcMar>
-          </w:tcPr>
-          <w:p>
-            <w:pPr>
-              <w:pStyle w:val="TableText"/>
-            </w:pPr>
-            <w:r>
-              <w:rPr>
-                <w:rFonts w:ascii="Lato" w:cs="Lato" w:eastAsia="Lato" w:hAnsi="Lato"/>
-              </w:rPr>
-              <w:t xml:space="preserve">#D5EBEE</w:t>
+            <w:shd w:fill="D2DCE8" w:color="auto" w:val="clear"/>
+            <w:tcMar>
+              <w:top w:type="dxa" w:w="90"/>
+              <w:left w:type="dxa" w:w="140"/>
+              <w:bottom w:type="dxa" w:w="90"/>
+              <w:right w:type="dxa" w:w="140"/>
+            </w:tcMar>
+          </w:tcPr>
+          <w:p>
+            <w:pPr>
+              <w:pStyle w:val="TableText"/>
+            </w:pPr>
+            <w:r>
+              <w:rPr>
+                <w:rFonts w:ascii="Lato" w:cs="Lato" w:eastAsia="Lato" w:hAnsi="Lato"/>
+              </w:rPr>
+              <w:t xml:space="preserve">#D2DCE8</w:t>
             </w:r>
           </w:p>
         </w:tc>
@@ -3146,7 +3146,7 @@
               <w:bottom w:val="single" w:color="C9CDD6" w:sz="4"/>
               <w:right w:val="single" w:color="C9CDD6" w:sz="4"/>
             </w:tcBorders>
-            <w:shd w:fill="F2DEE9" w:color="auto" w:val="clear"/>
+            <w:shd w:fill="F7D0E6" w:color="auto" w:val="clear"/>
             <w:tcMar>
               <w:top w:type="dxa" w:w="90"/>
               <w:left w:type="dxa" w:w="140"/>
@@ -3221,23 +3221,23 @@
               <w:bottom w:val="single" w:color="C9CDD6" w:sz="4"/>
               <w:right w:val="single" w:color="C9CDD6" w:sz="4"/>
             </w:tcBorders>
-            <w:shd w:fill="F2DEE9" w:color="auto" w:val="clear"/>
-            <w:tcMar>
-              <w:top w:type="dxa" w:w="90"/>
-              <w:left w:type="dxa" w:w="140"/>
-              <w:bottom w:type="dxa" w:w="90"/>
-              <w:right w:type="dxa" w:w="140"/>
-            </w:tcMar>
-          </w:tcPr>
-          <w:p>
-            <w:pPr>
-              <w:pStyle w:val="TableText"/>
-            </w:pPr>
-            <w:r>
-              <w:rPr>
-                <w:rFonts w:ascii="Lato" w:cs="Lato" w:eastAsia="Lato" w:hAnsi="Lato"/>
-              </w:rPr>
-              <w:t xml:space="preserve">#F2DEE9</w:t>
+            <w:shd w:fill="F7D0E6" w:color="auto" w:val="clear"/>
+            <w:tcMar>
+              <w:top w:type="dxa" w:w="90"/>
+              <w:left w:type="dxa" w:w="140"/>
+              <w:bottom w:type="dxa" w:w="90"/>
+              <w:right w:type="dxa" w:w="140"/>
+            </w:tcMar>
+          </w:tcPr>
+          <w:p>
+            <w:pPr>
+              <w:pStyle w:val="TableText"/>
+            </w:pPr>
+            <w:r>
+              <w:rPr>
+                <w:rFonts w:ascii="Lato" w:cs="Lato" w:eastAsia="Lato" w:hAnsi="Lato"/>
+              </w:rPr>
+              <w:t xml:space="preserve">#F7D0E6</w:t>
             </w:r>
           </w:p>
         </w:tc>

</xml_diff>